<commit_message>
Simplify pricing to ₹499 per charger per month in pitch and revenue model
Co-Authored-By: Claude Opus 5.5 <noreply@anthropic.com>
Claude-Session: https://claude.ai/code/session_011pCjtwAcALqYuUwPF39vNN
</commit_message>
<xml_diff>
--- a/docs/outreach/1_EVNest_Committee_Pitch_v2.docx
+++ b/docs/outreach/1_EVNest_Committee_Pitch_v2.docx
@@ -519,284 +519,92 @@
         <w:t xml:space="preserve">Cost</w:t>
       </w:r>
     </w:p>
-    <w:tbl>
-      <w:tblPr>
-        <w:tblW w:type="dxa" w:w="9026"/>
-        <w:tblBorders>
-          <w:top w:val="single" w:color="auto" w:sz="4"/>
-          <w:left w:val="single" w:color="auto" w:sz="4"/>
-          <w:bottom w:val="single" w:color="auto" w:sz="4"/>
-          <w:right w:val="single" w:color="auto" w:sz="4"/>
-          <w:insideH w:val="single" w:color="auto" w:sz="4"/>
-          <w:insideV w:val="single" w:color="auto" w:sz="4"/>
-        </w:tblBorders>
-      </w:tblPr>
-      <w:tblGrid>
-        <w:gridCol w:w="3000"/>
-        <w:gridCol w:w="6026"/>
-      </w:tblGrid>
-      <w:tr>
-        <w:trPr>
-          <w:tblHeader/>
-        </w:trPr>
-        <w:tc>
-          <w:tcPr>
-            <w:tcW w:type="dxa" w:w="3000"/>
-            <w:tcBorders>
-              <w:top w:val="single" w:color="BFBFBF" w:sz="4"/>
-              <w:left w:val="single" w:color="BFBFBF" w:sz="4"/>
-              <w:bottom w:val="single" w:color="BFBFBF" w:sz="4"/>
-              <w:right w:val="single" w:color="BFBFBF" w:sz="4"/>
-            </w:tcBorders>
-            <w:shd w:fill="1F5F6B" w:color="auto" w:val="clear"/>
-            <w:tcMar>
-              <w:top w:type="dxa" w:w="70"/>
-              <w:left w:type="dxa" w:w="100"/>
-              <w:bottom w:type="dxa" w:w="70"/>
-              <w:right w:type="dxa" w:w="100"/>
-            </w:tcMar>
-          </w:tcPr>
-          <w:p>
-            <w:r>
-              <w:rPr>
-                <w:b/>
-                <w:bCs/>
-                <w:color w:val="FFFFFF"/>
-                <w:sz w:val="18"/>
-                <w:szCs w:val="18"/>
-              </w:rPr>
-              <w:t xml:space="preserve">Stage</w:t>
-            </w:r>
-          </w:p>
-        </w:tc>
-        <w:tc>
-          <w:tcPr>
-            <w:tcW w:type="dxa" w:w="6026"/>
-            <w:tcBorders>
-              <w:top w:val="single" w:color="BFBFBF" w:sz="4"/>
-              <w:left w:val="single" w:color="BFBFBF" w:sz="4"/>
-              <w:bottom w:val="single" w:color="BFBFBF" w:sz="4"/>
-              <w:right w:val="single" w:color="BFBFBF" w:sz="4"/>
-            </w:tcBorders>
-            <w:shd w:fill="1F5F6B" w:color="auto" w:val="clear"/>
-            <w:tcMar>
-              <w:top w:type="dxa" w:w="70"/>
-              <w:left w:type="dxa" w:w="100"/>
-              <w:bottom w:type="dxa" w:w="70"/>
-              <w:right w:type="dxa" w:w="100"/>
-            </w:tcMar>
-          </w:tcPr>
-          <w:p>
-            <w:r>
-              <w:rPr>
-                <w:b/>
-                <w:bCs/>
-                <w:color w:val="FFFFFF"/>
-                <w:sz w:val="18"/>
-                <w:szCs w:val="18"/>
-              </w:rPr>
-              <w:t xml:space="preserve">Price</w:t>
-            </w:r>
-          </w:p>
-        </w:tc>
-      </w:tr>
-      <w:tr>
-        <w:trPr>
-          <w:tblHeader w:val="off"/>
-        </w:trPr>
-        <w:tc>
-          <w:tcPr>
-            <w:tcW w:type="dxa" w:w="3000"/>
-            <w:tcBorders>
-              <w:top w:val="single" w:color="BFBFBF" w:sz="4"/>
-              <w:left w:val="single" w:color="BFBFBF" w:sz="4"/>
-              <w:bottom w:val="single" w:color="BFBFBF" w:sz="4"/>
-              <w:right w:val="single" w:color="BFBFBF" w:sz="4"/>
-            </w:tcBorders>
-            <w:tcMar>
-              <w:top w:type="dxa" w:w="70"/>
-              <w:left w:type="dxa" w:w="100"/>
-              <w:bottom w:type="dxa" w:w="70"/>
-              <w:right w:type="dxa" w:w="100"/>
-            </w:tcMar>
-          </w:tcPr>
-          <w:p>
-            <w:r>
-              <w:rPr>
-                <w:b w:val="false"/>
-                <w:bCs w:val="false"/>
-                <w:sz w:val="18"/>
-                <w:szCs w:val="18"/>
-              </w:rPr>
-              <w:t xml:space="preserve">8-week pilot</w:t>
-            </w:r>
-          </w:p>
-        </w:tc>
-        <w:tc>
-          <w:tcPr>
-            <w:tcW w:type="dxa" w:w="6026"/>
-            <w:tcBorders>
-              <w:top w:val="single" w:color="BFBFBF" w:sz="4"/>
-              <w:left w:val="single" w:color="BFBFBF" w:sz="4"/>
-              <w:bottom w:val="single" w:color="BFBFBF" w:sz="4"/>
-              <w:right w:val="single" w:color="BFBFBF" w:sz="4"/>
-            </w:tcBorders>
-            <w:tcMar>
-              <w:top w:type="dxa" w:w="70"/>
-              <w:left w:type="dxa" w:w="100"/>
-              <w:bottom w:type="dxa" w:w="70"/>
-              <w:right w:type="dxa" w:w="100"/>
-            </w:tcMar>
-          </w:tcPr>
-          <w:p>
-            <w:r>
-              <w:rPr>
-                <w:b w:val="false"/>
-                <w:bCs w:val="false"/>
-                <w:sz w:val="18"/>
-                <w:szCs w:val="18"/>
-              </w:rPr>
-              <w:t xml:space="preserve">Free</w:t>
-            </w:r>
-          </w:p>
-        </w:tc>
-      </w:tr>
-      <w:tr>
-        <w:trPr>
-          <w:tblHeader w:val="off"/>
-        </w:trPr>
-        <w:tc>
-          <w:tcPr>
-            <w:tcW w:type="dxa" w:w="3000"/>
-            <w:tcBorders>
-              <w:top w:val="single" w:color="BFBFBF" w:sz="4"/>
-              <w:left w:val="single" w:color="BFBFBF" w:sz="4"/>
-              <w:bottom w:val="single" w:color="BFBFBF" w:sz="4"/>
-              <w:right w:val="single" w:color="BFBFBF" w:sz="4"/>
-            </w:tcBorders>
-            <w:shd w:fill="F5F5F5" w:color="auto" w:val="clear"/>
-            <w:tcMar>
-              <w:top w:type="dxa" w:w="70"/>
-              <w:left w:type="dxa" w:w="100"/>
-              <w:bottom w:type="dxa" w:w="70"/>
-              <w:right w:type="dxa" w:w="100"/>
-            </w:tcMar>
-          </w:tcPr>
-          <w:p>
-            <w:r>
-              <w:rPr>
-                <w:b w:val="false"/>
-                <w:bCs w:val="false"/>
-                <w:sz w:val="18"/>
-                <w:szCs w:val="18"/>
-              </w:rPr>
-              <w:t xml:space="preserve">After the pilot (only if the committee agrees)</w:t>
-            </w:r>
-          </w:p>
-        </w:tc>
-        <w:tc>
-          <w:tcPr>
-            <w:tcW w:type="dxa" w:w="6026"/>
-            <w:tcBorders>
-              <w:top w:val="single" w:color="BFBFBF" w:sz="4"/>
-              <w:left w:val="single" w:color="BFBFBF" w:sz="4"/>
-              <w:bottom w:val="single" w:color="BFBFBF" w:sz="4"/>
-              <w:right w:val="single" w:color="BFBFBF" w:sz="4"/>
-            </w:tcBorders>
-            <w:shd w:fill="F5F5F5" w:color="auto" w:val="clear"/>
-            <w:tcMar>
-              <w:top w:type="dxa" w:w="70"/>
-              <w:left w:type="dxa" w:w="100"/>
-              <w:bottom w:type="dxa" w:w="70"/>
-              <w:right w:type="dxa" w:w="100"/>
-            </w:tcMar>
-          </w:tcPr>
-          <w:p>
-            <w:r>
-              <w:rPr>
-                <w:b w:val="false"/>
-                <w:bCs w:val="false"/>
-                <w:sz w:val="18"/>
-                <w:szCs w:val="18"/>
-              </w:rPr>
-              <w:t xml:space="preserve">₹1,999 per month for up to 4 chargers (+₹399 per extra charger), or ₹19,990 per year</w:t>
-            </w:r>
-          </w:p>
-        </w:tc>
-      </w:tr>
-      <w:tr>
-        <w:trPr>
-          <w:tblHeader w:val="off"/>
-        </w:trPr>
-        <w:tc>
-          <w:tcPr>
-            <w:tcW w:type="dxa" w:w="3000"/>
-            <w:tcBorders>
-              <w:top w:val="single" w:color="BFBFBF" w:sz="4"/>
-              <w:left w:val="single" w:color="BFBFBF" w:sz="4"/>
-              <w:bottom w:val="single" w:color="BFBFBF" w:sz="4"/>
-              <w:right w:val="single" w:color="BFBFBF" w:sz="4"/>
-            </w:tcBorders>
-            <w:tcMar>
-              <w:top w:type="dxa" w:w="70"/>
-              <w:left w:type="dxa" w:w="100"/>
-              <w:bottom w:type="dxa" w:w="70"/>
-              <w:right w:type="dxa" w:w="100"/>
-            </w:tcMar>
-          </w:tcPr>
-          <w:p>
-            <w:r>
-              <w:rPr>
-                <w:b w:val="false"/>
-                <w:bCs w:val="false"/>
-                <w:sz w:val="18"/>
-                <w:szCs w:val="18"/>
-              </w:rPr>
-              <w:t xml:space="preserve">Founding society</w:t>
-            </w:r>
-          </w:p>
-        </w:tc>
-        <w:tc>
-          <w:tcPr>
-            <w:tcW w:type="dxa" w:w="6026"/>
-            <w:tcBorders>
-              <w:top w:val="single" w:color="BFBFBF" w:sz="4"/>
-              <w:left w:val="single" w:color="BFBFBF" w:sz="4"/>
-              <w:bottom w:val="single" w:color="BFBFBF" w:sz="4"/>
-              <w:right w:val="single" w:color="BFBFBF" w:sz="4"/>
-            </w:tcBorders>
-            <w:tcMar>
-              <w:top w:type="dxa" w:w="70"/>
-              <w:left w:type="dxa" w:w="100"/>
-              <w:bottom w:type="dxa" w:w="70"/>
-              <w:right w:type="dxa" w:w="100"/>
-            </w:tcMar>
-          </w:tcPr>
-          <w:p>
-            <w:r>
-              <w:rPr>
-                <w:b w:val="false"/>
-                <w:bCs w:val="false"/>
-                <w:sz w:val="18"/>
-                <w:szCs w:val="18"/>
-              </w:rPr>
-              <w:t xml:space="preserve">50% off the first year</w:t>
-            </w:r>
-          </w:p>
-        </w:tc>
-      </w:tr>
-    </w:tbl>
-    <w:p>
-      <w:pPr>
-        <w:spacing w:after="100"/>
-      </w:pPr>
+    <w:p>
+      <w:pPr>
+        <w:pStyle w:val="ListParagraph"/>
+        <w:numPr>
+          <w:ilvl w:val="0"/>
+          <w:numId w:val="2"/>
+        </w:numPr>
+        <w:spacing w:after="70"/>
+      </w:pPr>
+      <w:r>
+        <w:rPr>
+          <w:b/>
+          <w:bCs/>
+        </w:rPr>
+        <w:t xml:space="preserve">Pilot (8 weeks): free.</w:t>
+      </w:r>
+    </w:p>
+    <w:p>
+      <w:pPr>
+        <w:pStyle w:val="ListParagraph"/>
+        <w:numPr>
+          <w:ilvl w:val="0"/>
+          <w:numId w:val="2"/>
+        </w:numPr>
+        <w:spacing w:after="70"/>
+      </w:pPr>
+      <w:r>
+        <w:rPr>
+          <w:b/>
+          <w:bCs/>
+        </w:rPr>
+        <w:t xml:space="preserve">After the pilot: ₹499 per charger per month</w:t>
+      </w:r>
+      <w:r>
+        <w:t xml:space="preserve"> — only if the committee decides to continue.</w:t>
+      </w:r>
+    </w:p>
+    <w:p>
+      <w:pPr>
+        <w:pStyle w:val="ListParagraph"/>
+        <w:numPr>
+          <w:ilvl w:val="0"/>
+          <w:numId w:val="2"/>
+        </w:numPr>
+        <w:spacing w:after="70"/>
+      </w:pPr>
+      <w:r>
+        <w:t xml:space="preserve">For our 5 chargers that is </w:t>
+      </w:r>
+      <w:r>
+        <w:rPr>
+          <w:b/>
+          <w:bCs/>
+        </w:rPr>
+        <w:t xml:space="preserve">₹2,495 a month</w:t>
+      </w:r>
+      <w:r>
+        <w:t xml:space="preserve"> (about 60 paise per flat).</w:t>
+      </w:r>
+    </w:p>
+    <w:p>
+      <w:pPr>
+        <w:pStyle w:val="ListParagraph"/>
+        <w:numPr>
+          <w:ilvl w:val="0"/>
+          <w:numId w:val="2"/>
+        </w:numPr>
+        <w:spacing w:after="70"/>
+      </w:pPr>
+      <w:r>
+        <w:t xml:space="preserve">As the first society, </w:t>
+      </w:r>
+      <w:r>
+        <w:rPr>
+          <w:b/>
+          <w:bCs/>
+        </w:rPr>
+        <w:t xml:space="preserve">50% off for the first year: ₹1,248 a month.</w:t>
+      </w:r>
     </w:p>
     <w:p>
       <w:pPr>
         <w:spacing w:after="120"/>
       </w:pPr>
       <w:r>
-        <w:t xml:space="preserve">For a society of 4,000+ flats with, for example, 10 shared chargers, that is ₹4,393 a month — about ₹1 per flat. At the end of the pilot we review the results together — disputes, waiting, admin time — before any payment is discussed.</w:t>
+        <w:t xml:space="preserve">No payment is discussed until we have reviewed the pilot results together.</w:t>
       </w:r>
     </w:p>
     <w:p>

</xml_diff>